<commit_message>
Kredit sablonlari: teminat4, i_mno, avtomobil + DYP
</commit_message>
<xml_diff>
--- a/FinNex.UI/wwwroot/Files/Word/Kredit/BTI_salinma.docx
+++ b/FinNex.UI/wwwroot/Files/Word/Kredit/BTI_salinma.docx
@@ -124,7 +124,7 @@
             <v:path o:extrusionok="f" gradientshapeok="t" o:connecttype="rect"/>
             <o:lock v:ext="edit" aspectratio="t"/>
           </v:shapetype>
-          <v:shape id="_x0000_i1025" type="#_x0000_t75" style="width:59.35pt;height:72.6pt">
+          <v:shape id="_x0000_i1025" type="#_x0000_t75" style="width:59.65pt;height:72.45pt">
             <v:imagedata r:id="rId5" o:title="پیوست-نامه-2--پیوست 1"/>
           </v:shape>
         </w:pict>
@@ -293,18 +293,8 @@
           <w:color w:val="632423"/>
           <w:lang w:val="en-US"/>
         </w:rPr>
-        <w:t xml:space="preserve">8 </w:t>
-      </w:r>
-      <w:proofErr w:type="spellStart"/>
-      <w:r>
-        <w:rPr>
-          <w:b/>
-          <w:color w:val="632423"/>
-          <w:lang w:val="en-US"/>
-        </w:rPr>
-        <w:t>Noyabr</w:t>
-      </w:r>
-      <w:proofErr w:type="spellEnd"/>
+        <w:t>8 Noyabr</w:t>
+      </w:r>
       <w:r>
         <w:rPr>
           <w:b/>
@@ -537,31 +527,7 @@
           <w:u w:val="single"/>
           <w:lang w:val="fr-FR"/>
         </w:rPr>
-        <w:t>{</w:t>
-      </w:r>
-      <w:proofErr w:type="spellStart"/>
-      <w:r>
-        <w:rPr>
-          <w:b/>
-          <w:color w:val="000000"/>
-          <w:sz w:val="28"/>
-          <w:szCs w:val="28"/>
-          <w:u w:val="single"/>
-          <w:lang w:val="fr-FR"/>
-        </w:rPr>
-        <w:t>mekno</w:t>
-      </w:r>
-      <w:proofErr w:type="spellEnd"/>
-      <w:r>
-        <w:rPr>
-          <w:b/>
-          <w:color w:val="000000"/>
-          <w:sz w:val="28"/>
-          <w:szCs w:val="28"/>
-          <w:u w:val="single"/>
-          <w:lang w:val="fr-FR"/>
-        </w:rPr>
-        <w:t>}</w:t>
+        <w:t>{mekno}</w:t>
       </w:r>
     </w:p>
     <w:p>
@@ -736,7 +702,6 @@
           <w:lang w:val="az-Latn-AZ"/>
         </w:rPr>
       </w:pPr>
-      <w:proofErr w:type="spellStart"/>
       <w:r>
         <w:rPr>
           <w:bCs/>
@@ -744,9 +709,8 @@
           <w:szCs w:val="28"/>
           <w:lang w:val="fr-FR"/>
         </w:rPr>
-        <w:t>Yazıb</w:t>
-      </w:r>
-      <w:proofErr w:type="spellEnd"/>
+        <w:t>Yazıb Sizdən xahiş edirik ki,</w:t>
+      </w:r>
       <w:r>
         <w:rPr>
           <w:bCs/>
@@ -756,227 +720,130 @@
         </w:rPr>
         <w:t xml:space="preserve"> </w:t>
       </w:r>
-      <w:proofErr w:type="spellStart"/>
-      <w:r>
-        <w:rPr>
+      <w:r>
+        <w:rPr>
+          <w:sz w:val="28"/>
+          <w:szCs w:val="28"/>
+          <w:lang w:val="az-Latn-AZ"/>
+        </w:rPr>
+        <w:t>{i_saa}</w:t>
+      </w:r>
+      <w:r>
+        <w:rPr>
+          <w:b/>
           <w:bCs/>
           <w:sz w:val="28"/>
           <w:szCs w:val="28"/>
+          <w:lang w:val="az-Latn-AZ"/>
+        </w:rPr>
+        <w:t xml:space="preserve"> </w:t>
+      </w:r>
+      <w:r>
+        <w:rPr>
+          <w:bCs/>
+          <w:sz w:val="28"/>
+          <w:szCs w:val="28"/>
+          <w:lang w:val="az-Latn-AZ"/>
+        </w:rPr>
+        <w:t>ilə bağladığımız</w:t>
+      </w:r>
+      <w:r>
+        <w:rPr>
+          <w:b/>
+          <w:color w:val="000000"/>
+          <w:sz w:val="28"/>
+          <w:szCs w:val="28"/>
+          <w:lang w:val="az-Latn-AZ"/>
+        </w:rPr>
+        <w:t xml:space="preserve"> </w:t>
+      </w:r>
+      <w:r>
+        <w:rPr>
+          <w:sz w:val="28"/>
+          <w:szCs w:val="28"/>
+          <w:lang w:val="az-Latn-AZ"/>
+        </w:rPr>
+        <w:t>{</w:t>
+      </w:r>
+      <w:r>
+        <w:rPr>
+          <w:sz w:val="28"/>
+          <w:szCs w:val="28"/>
+          <w:lang w:val="az-Latn-AZ"/>
+        </w:rPr>
+        <w:t>k_tar_soz</w:t>
+      </w:r>
+      <w:r>
+        <w:rPr>
+          <w:sz w:val="28"/>
+          <w:szCs w:val="28"/>
+          <w:lang w:val="az-Latn-AZ"/>
+        </w:rPr>
+        <w:t>}</w:t>
+      </w:r>
+      <w:r>
+        <w:rPr>
+          <w:b/>
+          <w:bCs/>
+          <w:sz w:val="28"/>
+          <w:szCs w:val="28"/>
+          <w:lang w:val="az-Latn-AZ"/>
+        </w:rPr>
+        <w:t xml:space="preserve"> </w:t>
+      </w:r>
+      <w:r>
+        <w:rPr>
+          <w:bCs/>
+          <w:sz w:val="28"/>
+          <w:szCs w:val="28"/>
+          <w:lang w:val="az-Latn-AZ"/>
+        </w:rPr>
+        <w:t>il</w:t>
+      </w:r>
+      <w:r>
+        <w:rPr>
+          <w:bCs/>
+          <w:sz w:val="28"/>
+          <w:szCs w:val="28"/>
           <w:lang w:val="fr-FR"/>
         </w:rPr>
-        <w:t>Sizdən</w:t>
-      </w:r>
-      <w:proofErr w:type="spellEnd"/>
+        <w:t xml:space="preserve"> </w:t>
+      </w:r>
       <w:r>
         <w:rPr>
           <w:bCs/>
           <w:sz w:val="28"/>
           <w:szCs w:val="28"/>
+          <w:lang w:val="az-Latn-AZ"/>
+        </w:rPr>
+        <w:t>tarixli</w:t>
+      </w:r>
+      <w:r>
+        <w:rPr>
+          <w:bCs/>
+          <w:sz w:val="28"/>
+          <w:szCs w:val="28"/>
           <w:lang w:val="fr-FR"/>
         </w:rPr>
-        <w:t xml:space="preserve"> </w:t>
-      </w:r>
-      <w:proofErr w:type="spellStart"/>
-      <w:r>
-        <w:rPr>
-          <w:bCs/>
+        <w:t> </w:t>
+      </w:r>
+      <w:r>
+        <w:rPr>
           <w:sz w:val="28"/>
           <w:szCs w:val="28"/>
           <w:lang w:val="fr-FR"/>
         </w:rPr>
-        <w:t>xahiş</w:t>
-      </w:r>
-      <w:proofErr w:type="spellEnd"/>
-      <w:r>
-        <w:rPr>
-          <w:bCs/>
+        <w:t>{i</w:t>
+      </w:r>
+      <w:bookmarkStart w:id="0" w:name="_GoBack"/>
+      <w:bookmarkEnd w:id="0"/>
+      <w:r>
+        <w:rPr>
           <w:sz w:val="28"/>
           <w:szCs w:val="28"/>
           <w:lang w:val="fr-FR"/>
         </w:rPr>
-        <w:t xml:space="preserve"> </w:t>
-      </w:r>
-      <w:proofErr w:type="spellStart"/>
-      <w:r>
-        <w:rPr>
-          <w:bCs/>
-          <w:sz w:val="28"/>
-          <w:szCs w:val="28"/>
-          <w:lang w:val="fr-FR"/>
-        </w:rPr>
-        <w:t>edirik</w:t>
-      </w:r>
-      <w:proofErr w:type="spellEnd"/>
-      <w:r>
-        <w:rPr>
-          <w:bCs/>
-          <w:sz w:val="28"/>
-          <w:szCs w:val="28"/>
-          <w:lang w:val="fr-FR"/>
-        </w:rPr>
-        <w:t xml:space="preserve"> </w:t>
-      </w:r>
-      <w:proofErr w:type="spellStart"/>
-      <w:r>
-        <w:rPr>
-          <w:bCs/>
-          <w:sz w:val="28"/>
-          <w:szCs w:val="28"/>
-          <w:lang w:val="fr-FR"/>
-        </w:rPr>
-        <w:t>ki</w:t>
-      </w:r>
-      <w:proofErr w:type="spellEnd"/>
-      <w:r>
-        <w:rPr>
-          <w:bCs/>
-          <w:sz w:val="28"/>
-          <w:szCs w:val="28"/>
-          <w:lang w:val="fr-FR"/>
-        </w:rPr>
-        <w:t>,</w:t>
-      </w:r>
-      <w:r>
-        <w:rPr>
-          <w:bCs/>
-          <w:sz w:val="28"/>
-          <w:szCs w:val="28"/>
-          <w:lang w:val="fr-FR"/>
-        </w:rPr>
-        <w:t xml:space="preserve"> </w:t>
-      </w:r>
-      <w:r>
-        <w:rPr>
-          <w:sz w:val="28"/>
-          <w:szCs w:val="28"/>
-          <w:lang w:val="az-Latn-AZ"/>
-        </w:rPr>
-        <w:t>{i_saa}</w:t>
-      </w:r>
-      <w:r>
-        <w:rPr>
-          <w:b/>
-          <w:bCs/>
-          <w:sz w:val="28"/>
-          <w:szCs w:val="28"/>
-          <w:lang w:val="az-Latn-AZ"/>
-        </w:rPr>
-        <w:t xml:space="preserve"> </w:t>
-      </w:r>
-      <w:r>
-        <w:rPr>
-          <w:bCs/>
-          <w:sz w:val="28"/>
-          <w:szCs w:val="28"/>
-          <w:lang w:val="az-Latn-AZ"/>
-        </w:rPr>
-        <w:t>ilə bağladığımız</w:t>
-      </w:r>
-      <w:r>
-        <w:rPr>
-          <w:b/>
-          <w:color w:val="000000"/>
-          <w:sz w:val="28"/>
-          <w:szCs w:val="28"/>
-          <w:lang w:val="az-Latn-AZ"/>
-        </w:rPr>
-        <w:t xml:space="preserve"> </w:t>
-      </w:r>
-      <w:r>
-        <w:rPr>
-          <w:sz w:val="28"/>
-          <w:szCs w:val="28"/>
-          <w:lang w:val="az-Latn-AZ"/>
-        </w:rPr>
-        <w:t>{</w:t>
-      </w:r>
-      <w:r>
-        <w:rPr>
-          <w:sz w:val="28"/>
-          <w:szCs w:val="28"/>
-          <w:lang w:val="az-Latn-AZ"/>
-        </w:rPr>
-        <w:t>k_tar_soz</w:t>
-      </w:r>
-      <w:r>
-        <w:rPr>
-          <w:sz w:val="28"/>
-          <w:szCs w:val="28"/>
-          <w:lang w:val="az-Latn-AZ"/>
-        </w:rPr>
-        <w:t>}</w:t>
-      </w:r>
-      <w:r>
-        <w:rPr>
-          <w:b/>
-          <w:bCs/>
-          <w:sz w:val="28"/>
-          <w:szCs w:val="28"/>
-          <w:lang w:val="az-Latn-AZ"/>
-        </w:rPr>
-        <w:t xml:space="preserve"> </w:t>
-      </w:r>
-      <w:r>
-        <w:rPr>
-          <w:bCs/>
-          <w:sz w:val="28"/>
-          <w:szCs w:val="28"/>
-          <w:lang w:val="az-Latn-AZ"/>
-        </w:rPr>
-        <w:t>il</w:t>
-      </w:r>
-      <w:r>
-        <w:rPr>
-          <w:bCs/>
-          <w:sz w:val="28"/>
-          <w:szCs w:val="28"/>
-          <w:lang w:val="fr-FR"/>
-        </w:rPr>
-        <w:t xml:space="preserve"> </w:t>
-      </w:r>
-      <w:r>
-        <w:rPr>
-          <w:bCs/>
-          <w:sz w:val="28"/>
-          <w:szCs w:val="28"/>
-          <w:lang w:val="az-Latn-AZ"/>
-        </w:rPr>
-        <w:t>tarixli</w:t>
-      </w:r>
-      <w:r>
-        <w:rPr>
-          <w:bCs/>
-          <w:sz w:val="28"/>
-          <w:szCs w:val="28"/>
-          <w:lang w:val="fr-FR"/>
-        </w:rPr>
-        <w:t> </w:t>
-      </w:r>
-      <w:r>
-        <w:rPr>
-          <w:sz w:val="28"/>
-          <w:szCs w:val="28"/>
-          <w:lang w:val="fr-FR"/>
-        </w:rPr>
-        <w:t>{</w:t>
-      </w:r>
-      <w:proofErr w:type="spellStart"/>
-      <w:r>
-        <w:rPr>
-          <w:sz w:val="28"/>
-          <w:szCs w:val="28"/>
-          <w:lang w:val="fr-FR"/>
-        </w:rPr>
-        <w:t>k_mno</w:t>
-      </w:r>
-      <w:proofErr w:type="spellEnd"/>
-      <w:r>
-        <w:rPr>
-          <w:sz w:val="28"/>
-          <w:szCs w:val="28"/>
-          <w:lang w:val="fr-FR"/>
-        </w:rPr>
-        <w:t>}</w:t>
+        <w:t>_mno}</w:t>
       </w:r>
       <w:r>
         <w:rPr>
@@ -1031,18 +898,7 @@
           <w:szCs w:val="28"/>
           <w:lang w:val="az-Latn-AZ"/>
         </w:rPr>
-        <w:t xml:space="preserve"> müqaviləsinə </w:t>
-      </w:r>
-      <w:bookmarkStart w:id="0" w:name="_GoBack"/>
-      <w:bookmarkEnd w:id="0"/>
-      <w:r>
-        <w:rPr>
-          <w:bCs/>
-          <w:sz w:val="28"/>
-          <w:szCs w:val="28"/>
-          <w:lang w:val="az-Latn-AZ"/>
-        </w:rPr>
-        <w:t>əsasən</w:t>
+        <w:t xml:space="preserve"> müqaviləsinə əsasən</w:t>
       </w:r>
       <w:r>
         <w:rPr>

</xml_diff>